<commit_message>
Add REMARKS and fill content for Lab Reports 5, 6, and 7
</commit_message>
<xml_diff>
--- a/Laboratory-Report-No_-5-Updated.docx
+++ b/Laboratory-Report-No_-5-Updated.docx
@@ -1366,49 +1366,6 @@
         <w:t>[ Illustration 1: Basic Pneumatic System Diagram ]</w:t>
       </w:r>
     </w:p>
-    <w:p xmlns:w="http://schemas.openxmlformats.org/wordprocessingml/2006/main">
-      <w:pPr>
-        <w:spacing w:before="200" w:after="200" w:line="240" w:lineRule="auto"/>
-        <w:rPr>
-          <w:rFonts w:ascii="Book Antiqua" w:hAnsi="Book Antiqua"/>
-          <w:lang w:val="en-US"/>
-        </w:rPr>
-      </w:pPr>
-    </w:p>
-    <w:p xmlns:w="http://schemas.openxmlformats.org/wordprocessingml/2006/main">
-      <w:pPr>
-        <w:spacing w:before="400" w:after="400" w:line="240" w:lineRule="auto"/>
-        <w:jc w:val="center"/>
-        <w:rPr>
-          <w:rFonts w:ascii="Book Antiqua" w:hAnsi="Book Antiqua"/>
-          <w:i/>
-          <w:color w:val="1F5C99"/>
-          <w:sz w:val="20"/>
-          <w:szCs w:val="20"/>
-          <w:lang w:val="en-US"/>
-        </w:rPr>
-      </w:pPr>
-      <w:r>
-        <w:rPr>
-          <w:rFonts w:ascii="Book Antiqua" w:hAnsi="Book Antiqua"/>
-          <w:i/>
-          <w:color w:val="1F5C99"/>
-          <w:sz w:val="20"/>
-          <w:szCs w:val="20"/>
-          <w:lang w:val="en-US"/>
-        </w:rPr>
-        <w:t xml:space="preserve">[Image Reference - Basic Pneumatic System Diagram: https://www.researchgate.net/figure/Pneumatic-system-1-compressor-2-air-receiver-4-air-treatment-unit-4-control_fig1_326701415]</w:t>
-      </w:r>
-    </w:p>
-    <w:p xmlns:w="http://schemas.openxmlformats.org/wordprocessingml/2006/main">
-      <w:pPr>
-        <w:spacing w:before="200" w:after="200" w:line="240" w:lineRule="auto"/>
-        <w:rPr>
-          <w:rFonts w:ascii="Book Antiqua" w:hAnsi="Book Antiqua"/>
-          <w:lang w:val="en-US"/>
-        </w:rPr>
-      </w:pPr>
-    </w:p>
     <w:p>
       <w:pPr>
         <w:spacing w:after="0" w:line="360" w:lineRule="auto"/>
@@ -1706,49 +1663,6 @@
         <w:t>[ Illustration 2: Air Compressor ]</w:t>
       </w:r>
     </w:p>
-    <w:p xmlns:w="http://schemas.openxmlformats.org/wordprocessingml/2006/main">
-      <w:pPr>
-        <w:spacing w:before="200" w:after="200" w:line="240" w:lineRule="auto"/>
-        <w:rPr>
-          <w:rFonts w:ascii="Book Antiqua" w:hAnsi="Book Antiqua"/>
-          <w:lang w:val="en-US"/>
-        </w:rPr>
-      </w:pPr>
-    </w:p>
-    <w:p xmlns:w="http://schemas.openxmlformats.org/wordprocessingml/2006/main">
-      <w:pPr>
-        <w:spacing w:before="400" w:after="400" w:line="240" w:lineRule="auto"/>
-        <w:jc w:val="center"/>
-        <w:rPr>
-          <w:rFonts w:ascii="Book Antiqua" w:hAnsi="Book Antiqua"/>
-          <w:i/>
-          <w:color w:val="1F5C99"/>
-          <w:sz w:val="20"/>
-          <w:szCs w:val="20"/>
-          <w:lang w:val="en-US"/>
-        </w:rPr>
-      </w:pPr>
-      <w:r>
-        <w:rPr>
-          <w:rFonts w:ascii="Book Antiqua" w:hAnsi="Book Antiqua"/>
-          <w:i/>
-          <w:color w:val="1F5C99"/>
-          <w:sz w:val="20"/>
-          <w:szCs w:val="20"/>
-          <w:lang w:val="en-US"/>
-        </w:rPr>
-        <w:t xml:space="preserve">[Image Reference - Air Compressor: https://instrumentationtools.com/instrument-air-system/]</w:t>
-      </w:r>
-    </w:p>
-    <w:p xmlns:w="http://schemas.openxmlformats.org/wordprocessingml/2006/main">
-      <w:pPr>
-        <w:spacing w:before="200" w:after="200" w:line="240" w:lineRule="auto"/>
-        <w:rPr>
-          <w:rFonts w:ascii="Book Antiqua" w:hAnsi="Book Antiqua"/>
-          <w:lang w:val="en-US"/>
-        </w:rPr>
-      </w:pPr>
-    </w:p>
     <w:p>
       <w:pPr>
         <w:spacing w:after="0" w:line="360" w:lineRule="auto"/>
@@ -1812,49 +1726,6 @@
         <w:t>[ Illustration 3: Receiver Tank / Air Reservoir ]</w:t>
       </w:r>
     </w:p>
-    <w:p xmlns:w="http://schemas.openxmlformats.org/wordprocessingml/2006/main">
-      <w:pPr>
-        <w:spacing w:before="200" w:after="200" w:line="240" w:lineRule="auto"/>
-        <w:rPr>
-          <w:rFonts w:ascii="Book Antiqua" w:hAnsi="Book Antiqua"/>
-          <w:lang w:val="en-US"/>
-        </w:rPr>
-      </w:pPr>
-    </w:p>
-    <w:p xmlns:w="http://schemas.openxmlformats.org/wordprocessingml/2006/main">
-      <w:pPr>
-        <w:spacing w:before="400" w:after="400" w:line="240" w:lineRule="auto"/>
-        <w:jc w:val="center"/>
-        <w:rPr>
-          <w:rFonts w:ascii="Book Antiqua" w:hAnsi="Book Antiqua"/>
-          <w:i/>
-          <w:color w:val="1F5C99"/>
-          <w:sz w:val="20"/>
-          <w:szCs w:val="20"/>
-          <w:lang w:val="en-US"/>
-        </w:rPr>
-      </w:pPr>
-      <w:r>
-        <w:rPr>
-          <w:rFonts w:ascii="Book Antiqua" w:hAnsi="Book Antiqua"/>
-          <w:i/>
-          <w:color w:val="1F5C99"/>
-          <w:sz w:val="20"/>
-          <w:szCs w:val="20"/>
-          <w:lang w:val="en-US"/>
-        </w:rPr>
-        <w:t xml:space="preserve">[Image Reference - Receiver Tank / Air Reservoir: https://www.researchgate.net/figure/Diagram-of-compressed-air-system-1-compressor-2-air-receiver-tank-3-pipeline-4_fig5_328680054]</w:t>
-      </w:r>
-    </w:p>
-    <w:p xmlns:w="http://schemas.openxmlformats.org/wordprocessingml/2006/main">
-      <w:pPr>
-        <w:spacing w:before="200" w:after="200" w:line="240" w:lineRule="auto"/>
-        <w:rPr>
-          <w:rFonts w:ascii="Book Antiqua" w:hAnsi="Book Antiqua"/>
-          <w:lang w:val="en-US"/>
-        </w:rPr>
-      </w:pPr>
-    </w:p>
     <w:p>
       <w:pPr>
         <w:spacing w:after="0" w:line="360" w:lineRule="auto"/>
@@ -1918,49 +1789,6 @@
         <w:t>[ Illustration 4: FRL Unit (Filter-Regulator-Lubricator) ]</w:t>
       </w:r>
     </w:p>
-    <w:p xmlns:w="http://schemas.openxmlformats.org/wordprocessingml/2006/main">
-      <w:pPr>
-        <w:spacing w:before="200" w:after="200" w:line="240" w:lineRule="auto"/>
-        <w:rPr>
-          <w:rFonts w:ascii="Book Antiqua" w:hAnsi="Book Antiqua"/>
-          <w:lang w:val="en-US"/>
-        </w:rPr>
-      </w:pPr>
-    </w:p>
-    <w:p xmlns:w="http://schemas.openxmlformats.org/wordprocessingml/2006/main">
-      <w:pPr>
-        <w:spacing w:before="400" w:after="400" w:line="240" w:lineRule="auto"/>
-        <w:jc w:val="center"/>
-        <w:rPr>
-          <w:rFonts w:ascii="Book Antiqua" w:hAnsi="Book Antiqua"/>
-          <w:i/>
-          <w:color w:val="1F5C99"/>
-          <w:sz w:val="20"/>
-          <w:szCs w:val="20"/>
-          <w:lang w:val="en-US"/>
-        </w:rPr>
-      </w:pPr>
-      <w:r>
-        <w:rPr>
-          <w:rFonts w:ascii="Book Antiqua" w:hAnsi="Book Antiqua"/>
-          <w:i/>
-          <w:color w:val="1F5C99"/>
-          <w:sz w:val="20"/>
-          <w:szCs w:val="20"/>
-          <w:lang w:val="en-US"/>
-        </w:rPr>
-        <w:t xml:space="preserve">[Image Reference - FRL Unit (Filter-Regulator-Lubricator): https://tameson.com/pages/frl-filter-regulator-lubricator]</w:t>
-      </w:r>
-    </w:p>
-    <w:p xmlns:w="http://schemas.openxmlformats.org/wordprocessingml/2006/main">
-      <w:pPr>
-        <w:spacing w:before="200" w:after="200" w:line="240" w:lineRule="auto"/>
-        <w:rPr>
-          <w:rFonts w:ascii="Book Antiqua" w:hAnsi="Book Antiqua"/>
-          <w:lang w:val="en-US"/>
-        </w:rPr>
-      </w:pPr>
-    </w:p>
     <w:p>
       <w:pPr>
         <w:spacing w:after="0" w:line="360" w:lineRule="auto"/>
@@ -2024,49 +1852,6 @@
         <w:t>[ Illustration 5: 5/2-Way Directional Control Valve ]</w:t>
       </w:r>
     </w:p>
-    <w:p xmlns:w="http://schemas.openxmlformats.org/wordprocessingml/2006/main">
-      <w:pPr>
-        <w:spacing w:before="200" w:after="200" w:line="240" w:lineRule="auto"/>
-        <w:rPr>
-          <w:rFonts w:ascii="Book Antiqua" w:hAnsi="Book Antiqua"/>
-          <w:lang w:val="en-US"/>
-        </w:rPr>
-      </w:pPr>
-    </w:p>
-    <w:p xmlns:w="http://schemas.openxmlformats.org/wordprocessingml/2006/main">
-      <w:pPr>
-        <w:spacing w:before="400" w:after="400" w:line="240" w:lineRule="auto"/>
-        <w:jc w:val="center"/>
-        <w:rPr>
-          <w:rFonts w:ascii="Book Antiqua" w:hAnsi="Book Antiqua"/>
-          <w:i/>
-          <w:color w:val="1F5C99"/>
-          <w:sz w:val="20"/>
-          <w:szCs w:val="20"/>
-          <w:lang w:val="en-US"/>
-        </w:rPr>
-      </w:pPr>
-      <w:r>
-        <w:rPr>
-          <w:rFonts w:ascii="Book Antiqua" w:hAnsi="Book Antiqua"/>
-          <w:i/>
-          <w:color w:val="1F5C99"/>
-          <w:sz w:val="20"/>
-          <w:szCs w:val="20"/>
-          <w:lang w:val="en-US"/>
-        </w:rPr>
-        <w:t xml:space="preserve">[Image Reference - 5/2-Way Directional Control Valve: https://instrumentationtools.com/5-port-2-position-valve-animation/amp/]</w:t>
-      </w:r>
-    </w:p>
-    <w:p xmlns:w="http://schemas.openxmlformats.org/wordprocessingml/2006/main">
-      <w:pPr>
-        <w:spacing w:before="200" w:after="200" w:line="240" w:lineRule="auto"/>
-        <w:rPr>
-          <w:rFonts w:ascii="Book Antiqua" w:hAnsi="Book Antiqua"/>
-          <w:lang w:val="en-US"/>
-        </w:rPr>
-      </w:pPr>
-    </w:p>
     <w:p>
       <w:pPr>
         <w:spacing w:after="0" w:line="360" w:lineRule="auto"/>
@@ -2130,49 +1915,6 @@
         <w:t>[ Illustration 6: Double-Acting Pneumatic Cylinder ]</w:t>
       </w:r>
     </w:p>
-    <w:p xmlns:w="http://schemas.openxmlformats.org/wordprocessingml/2006/main">
-      <w:pPr>
-        <w:spacing w:before="200" w:after="200" w:line="240" w:lineRule="auto"/>
-        <w:rPr>
-          <w:rFonts w:ascii="Book Antiqua" w:hAnsi="Book Antiqua"/>
-          <w:lang w:val="en-US"/>
-        </w:rPr>
-      </w:pPr>
-    </w:p>
-    <w:p xmlns:w="http://schemas.openxmlformats.org/wordprocessingml/2006/main">
-      <w:pPr>
-        <w:spacing w:before="400" w:after="400" w:line="240" w:lineRule="auto"/>
-        <w:jc w:val="center"/>
-        <w:rPr>
-          <w:rFonts w:ascii="Book Antiqua" w:hAnsi="Book Antiqua"/>
-          <w:i/>
-          <w:color w:val="1F5C99"/>
-          <w:sz w:val="20"/>
-          <w:szCs w:val="20"/>
-          <w:lang w:val="en-US"/>
-        </w:rPr>
-      </w:pPr>
-      <w:r>
-        <w:rPr>
-          <w:rFonts w:ascii="Book Antiqua" w:hAnsi="Book Antiqua"/>
-          <w:i/>
-          <w:color w:val="1F5C99"/>
-          <w:sz w:val="20"/>
-          <w:szCs w:val="20"/>
-          <w:lang w:val="en-US"/>
-        </w:rPr>
-        <w:t xml:space="preserve">[Image Reference - Double-Acting Pneumatic Cylinder: https://instrumentationtools.com/pneumatic-cylinder/]</w:t>
-      </w:r>
-    </w:p>
-    <w:p xmlns:w="http://schemas.openxmlformats.org/wordprocessingml/2006/main">
-      <w:pPr>
-        <w:spacing w:before="200" w:after="200" w:line="240" w:lineRule="auto"/>
-        <w:rPr>
-          <w:rFonts w:ascii="Book Antiqua" w:hAnsi="Book Antiqua"/>
-          <w:lang w:val="en-US"/>
-        </w:rPr>
-      </w:pPr>
-    </w:p>
     <w:p>
       <w:pPr>
         <w:spacing w:after="0" w:line="360" w:lineRule="auto"/>
@@ -2307,6 +2049,27 @@
           <w:lang w:val="en-US"/>
         </w:rPr>
         <w:t>REMARKS:</w:t>
+      </w:r>
+    </w:p>
+    <w:p xmlns:w="http://schemas.openxmlformats.org/wordprocessingml/2006/main">
+      <w:pPr>
+        <w:spacing w:before="60" w:after="60" w:line="240" w:lineRule="auto"/>
+        <w:jc w:val="both"/>
+        <w:rPr>
+          <w:rFonts w:ascii="Book Antiqua" w:hAnsi="Book Antiqua"/>
+          <w:sz w:val="24"/>
+          <w:szCs w:val="24"/>
+          <w:lang w:val="en-US"/>
+        </w:rPr>
+      </w:pPr>
+      <w:r>
+        <w:rPr>
+          <w:rFonts w:ascii="Book Antiqua" w:hAnsi="Book Antiqua"/>
+          <w:sz w:val="24"/>
+          <w:szCs w:val="24"/>
+          <w:lang w:val="en-US"/>
+        </w:rPr>
+        <w:t xml:space="preserve">This laboratory activity gave a clear understanding of pneumatic systems and their industrial applications. The study of its components — from the air compressor to the pneumatic cylinder — showed how compressed air is effectively used to transmit power in various industrial settings. Despite its limitations such as noise and limited force output, pneumatic systems remain widely used due to their simplicity, safety, and speed.</w:t>
       </w:r>
     </w:p>
     <w:p>

</xml_diff>

<commit_message>
Shorten all answers to 1-2 sentences in Lab Reports 5, 6, and 7
</commit_message>
<xml_diff>
--- a/Laboratory-Report-No_-5-Updated.docx
+++ b/Laboratory-Report-No_-5-Updated.docx
@@ -1325,23 +1325,25 @@
         <w:t>1. What is a Pneumatic System?</w:t>
       </w:r>
     </w:p>
-    <w:p>
-      <w:pPr>
-        <w:spacing w:after="0" w:line="360" w:lineRule="auto"/>
+    <w:p xmlns:w="http://schemas.openxmlformats.org/wordprocessingml/2006/main">
+      <w:pPr>
+        <w:spacing w:before="60" w:after="60" w:line="240" w:lineRule="auto"/>
         <w:jc w:val="both"/>
         <w:rPr>
           <w:rFonts w:ascii="Book Antiqua" w:hAnsi="Book Antiqua"/>
           <w:sz w:val="24"/>
-          <w:lang w:val="en-US"/>
-        </w:rPr>
-      </w:pPr>
-      <w:r>
-        <w:rPr>
-          <w:rFonts w:ascii="Book Antiqua" w:hAnsi="Book Antiqua"/>
-          <w:sz w:val="24"/>
-          <w:lang w:val="en-US"/>
-        </w:rPr>
-        <w:t>A pneumatic system is a type of power transmission system that uses compressed air or gas to generate, transmit, and control mechanical force and motion. The word “pneumatic” is derived from the Greek word “pneuma,” meaning breath or air. In a pneumatic system, a compressor draws in atmospheric air, compresses it to a higher pressure, and stores it in a reservoir or receiver tank. This pressurized air is then distributed through a network of pipes and hoses to actuators such as pneumatic cylinders and motors, which convert the compressed air energy into mechanical work. Pneumatic systems are widely used in industrial automation, manufacturing, and transportation because compressed air is readily available, clean, safe, and easy to control.</w:t>
+          <w:szCs w:val="24"/>
+          <w:lang w:val="en-US"/>
+        </w:rPr>
+      </w:pPr>
+      <w:r>
+        <w:rPr>
+          <w:rFonts w:ascii="Book Antiqua" w:hAnsi="Book Antiqua"/>
+          <w:sz w:val="24"/>
+          <w:szCs w:val="24"/>
+          <w:lang w:val="en-US"/>
+        </w:rPr>
+        <w:t xml:space="preserve">A pneumatic system uses compressed air to generate and transmit mechanical force. It is widely used in industrial automation for operating tools, actuators, and control devices.</w:t>
       </w:r>
     </w:p>
     <w:p>
@@ -1387,23 +1389,214 @@
         <w:t>2. Advantages of Pneumatic Systems</w:t>
       </w:r>
     </w:p>
+    <w:p xmlns:w="http://schemas.openxmlformats.org/wordprocessingml/2006/main">
+      <w:pPr>
+        <w:spacing w:before="60" w:after="60" w:line="240" w:lineRule="auto"/>
+        <w:jc w:val="both"/>
+        <w:rPr>
+          <w:rFonts w:ascii="Book Antiqua" w:hAnsi="Book Antiqua"/>
+          <w:sz w:val="24"/>
+          <w:szCs w:val="24"/>
+          <w:lang w:val="en-US"/>
+        </w:rPr>
+      </w:pPr>
+      <w:r>
+        <w:rPr>
+          <w:rFonts w:ascii="Book Antiqua" w:hAnsi="Book Antiqua"/>
+          <w:sz w:val="24"/>
+          <w:szCs w:val="24"/>
+          <w:lang w:val="en-US"/>
+        </w:rPr>
+        <w:t xml:space="preserve">a. Safety – Compressed air is non-flammable and safe to use in hazardous environments.</w:t>
+      </w:r>
+    </w:p>
+    <w:p xmlns:w="http://schemas.openxmlformats.org/wordprocessingml/2006/main">
+      <w:pPr>
+        <w:spacing w:before="60" w:after="60" w:line="240" w:lineRule="auto"/>
+        <w:jc w:val="both"/>
+        <w:rPr>
+          <w:rFonts w:ascii="Book Antiqua" w:hAnsi="Book Antiqua"/>
+          <w:sz w:val="24"/>
+          <w:szCs w:val="24"/>
+          <w:lang w:val="en-US"/>
+        </w:rPr>
+      </w:pPr>
+      <w:r>
+        <w:rPr>
+          <w:rFonts w:ascii="Book Antiqua" w:hAnsi="Book Antiqua"/>
+          <w:sz w:val="24"/>
+          <w:szCs w:val="24"/>
+          <w:lang w:val="en-US"/>
+        </w:rPr>
+        <w:t xml:space="preserve">b. Cleanliness – Air exhaust does not contaminate the environment, making it ideal for food and pharmaceutical industries.</w:t>
+      </w:r>
+    </w:p>
+    <w:p xmlns:w="http://schemas.openxmlformats.org/wordprocessingml/2006/main">
+      <w:pPr>
+        <w:spacing w:before="60" w:after="60" w:line="240" w:lineRule="auto"/>
+        <w:jc w:val="both"/>
+        <w:rPr>
+          <w:rFonts w:ascii="Book Antiqua" w:hAnsi="Book Antiqua"/>
+          <w:sz w:val="24"/>
+          <w:szCs w:val="24"/>
+          <w:lang w:val="en-US"/>
+        </w:rPr>
+      </w:pPr>
+      <w:r>
+        <w:rPr>
+          <w:rFonts w:ascii="Book Antiqua" w:hAnsi="Book Antiqua"/>
+          <w:sz w:val="24"/>
+          <w:szCs w:val="24"/>
+          <w:lang w:val="en-US"/>
+        </w:rPr>
+        <w:t xml:space="preserve">c. High Speed Operation – Pneumatic actuators respond quickly, suitable for fast-cycle applications.</w:t>
+      </w:r>
+    </w:p>
+    <w:p xmlns:w="http://schemas.openxmlformats.org/wordprocessingml/2006/main">
+      <w:pPr>
+        <w:spacing w:before="60" w:after="60" w:line="240" w:lineRule="auto"/>
+        <w:jc w:val="both"/>
+        <w:rPr>
+          <w:rFonts w:ascii="Book Antiqua" w:hAnsi="Book Antiqua"/>
+          <w:sz w:val="24"/>
+          <w:szCs w:val="24"/>
+          <w:lang w:val="en-US"/>
+        </w:rPr>
+      </w:pPr>
+      <w:r>
+        <w:rPr>
+          <w:rFonts w:ascii="Book Antiqua" w:hAnsi="Book Antiqua"/>
+          <w:sz w:val="24"/>
+          <w:szCs w:val="24"/>
+          <w:lang w:val="en-US"/>
+        </w:rPr>
+        <w:t xml:space="preserve">d. Simplicity and Low Maintenance – Components are simple and require minimal maintenance.</w:t>
+      </w:r>
+    </w:p>
+    <w:p xmlns:w="http://schemas.openxmlformats.org/wordprocessingml/2006/main">
+      <w:pPr>
+        <w:spacing w:before="60" w:after="60" w:line="240" w:lineRule="auto"/>
+        <w:jc w:val="both"/>
+        <w:rPr>
+          <w:rFonts w:ascii="Book Antiqua" w:hAnsi="Book Antiqua"/>
+          <w:sz w:val="24"/>
+          <w:szCs w:val="24"/>
+          <w:lang w:val="en-US"/>
+        </w:rPr>
+      </w:pPr>
+      <w:r>
+        <w:rPr>
+          <w:rFonts w:ascii="Book Antiqua" w:hAnsi="Book Antiqua"/>
+          <w:sz w:val="24"/>
+          <w:szCs w:val="24"/>
+          <w:lang w:val="en-US"/>
+        </w:rPr>
+        <w:t xml:space="preserve">e. Energy Storage – Compressed air can be stored and used on demand, providing a reliable power reserve.</w:t>
+      </w:r>
+    </w:p>
     <w:p>
       <w:pPr>
         <w:spacing w:after="0" w:line="360" w:lineRule="auto"/>
         <w:jc w:val="both"/>
         <w:rPr>
           <w:rFonts w:ascii="Book Antiqua" w:hAnsi="Book Antiqua"/>
-          <w:sz w:val="24"/>
-          <w:lang w:val="en-US"/>
-        </w:rPr>
-      </w:pPr>
-      <w:r>
-        <w:rPr>
-          <w:rFonts w:ascii="Book Antiqua" w:hAnsi="Book Antiqua"/>
-          <w:sz w:val="24"/>
-          <w:lang w:val="en-US"/>
-        </w:rPr>
-        <w:t>a. Safety – Compressed air is non-flammable and non-toxic, making pneumatic systems inherently safe to use in hazardous environments such as chemical plants, paint booths, and food processing facilities where sparks or oil leaks from hydraulic systems could be dangerous.</w:t>
+          <w:b/>
+          <w:sz w:val="24"/>
+          <w:lang w:val="en-US"/>
+        </w:rPr>
+      </w:pPr>
+      <w:r>
+        <w:rPr>
+          <w:rFonts w:ascii="Book Antiqua" w:hAnsi="Book Antiqua"/>
+          <w:b/>
+          <w:sz w:val="24"/>
+          <w:lang w:val="en-US"/>
+        </w:rPr>
+        <w:t>3. Limitations of Pneumatic Systems</w:t>
+      </w:r>
+    </w:p>
+    <w:p xmlns:w="http://schemas.openxmlformats.org/wordprocessingml/2006/main">
+      <w:pPr>
+        <w:spacing w:before="60" w:after="60" w:line="240" w:lineRule="auto"/>
+        <w:jc w:val="both"/>
+        <w:rPr>
+          <w:rFonts w:ascii="Book Antiqua" w:hAnsi="Book Antiqua"/>
+          <w:sz w:val="24"/>
+          <w:szCs w:val="24"/>
+          <w:lang w:val="en-US"/>
+        </w:rPr>
+      </w:pPr>
+      <w:r>
+        <w:rPr>
+          <w:rFonts w:ascii="Book Antiqua" w:hAnsi="Book Antiqua"/>
+          <w:sz w:val="24"/>
+          <w:szCs w:val="24"/>
+          <w:lang w:val="en-US"/>
+        </w:rPr>
+        <w:t xml:space="preserve">a. Limited Force Output – Pneumatic systems produce lower force compared to hydraulic systems.</w:t>
+      </w:r>
+    </w:p>
+    <w:p xmlns:w="http://schemas.openxmlformats.org/wordprocessingml/2006/main">
+      <w:pPr>
+        <w:spacing w:before="60" w:after="60" w:line="240" w:lineRule="auto"/>
+        <w:jc w:val="both"/>
+        <w:rPr>
+          <w:rFonts w:ascii="Book Antiqua" w:hAnsi="Book Antiqua"/>
+          <w:sz w:val="24"/>
+          <w:szCs w:val="24"/>
+          <w:lang w:val="en-US"/>
+        </w:rPr>
+      </w:pPr>
+      <w:r>
+        <w:rPr>
+          <w:rFonts w:ascii="Book Antiqua" w:hAnsi="Book Antiqua"/>
+          <w:sz w:val="24"/>
+          <w:szCs w:val="24"/>
+          <w:lang w:val="en-US"/>
+        </w:rPr>
+        <w:t xml:space="preserve">b. Compressibility of Air – Air compressibility makes precise position control difficult.</w:t>
+      </w:r>
+    </w:p>
+    <w:p xmlns:w="http://schemas.openxmlformats.org/wordprocessingml/2006/main">
+      <w:pPr>
+        <w:spacing w:before="60" w:after="60" w:line="240" w:lineRule="auto"/>
+        <w:jc w:val="both"/>
+        <w:rPr>
+          <w:rFonts w:ascii="Book Antiqua" w:hAnsi="Book Antiqua"/>
+          <w:sz w:val="24"/>
+          <w:szCs w:val="24"/>
+          <w:lang w:val="en-US"/>
+        </w:rPr>
+      </w:pPr>
+      <w:r>
+        <w:rPr>
+          <w:rFonts w:ascii="Book Antiqua" w:hAnsi="Book Antiqua"/>
+          <w:sz w:val="24"/>
+          <w:szCs w:val="24"/>
+          <w:lang w:val="en-US"/>
+        </w:rPr>
+        <w:t xml:space="preserve">c. Noise – Exhaust air produces noise that may require silencers in work environments.</w:t>
+      </w:r>
+    </w:p>
+    <w:p xmlns:w="http://schemas.openxmlformats.org/wordprocessingml/2006/main">
+      <w:pPr>
+        <w:spacing w:before="60" w:after="60" w:line="240" w:lineRule="auto"/>
+        <w:jc w:val="both"/>
+        <w:rPr>
+          <w:rFonts w:ascii="Book Antiqua" w:hAnsi="Book Antiqua"/>
+          <w:sz w:val="24"/>
+          <w:szCs w:val="24"/>
+          <w:lang w:val="en-US"/>
+        </w:rPr>
+      </w:pPr>
+      <w:r>
+        <w:rPr>
+          <w:rFonts w:ascii="Book Antiqua" w:hAnsi="Book Antiqua"/>
+          <w:sz w:val="24"/>
+          <w:szCs w:val="24"/>
+          <w:lang w:val="en-US"/>
+        </w:rPr>
+        <w:t xml:space="preserve">d. Energy Inefficiency – Generating compressed air consumes significant electrical energy with notable losses.</w:t>
       </w:r>
     </w:p>
     <w:p>
@@ -1412,17 +1605,19 @@
         <w:jc w:val="both"/>
         <w:rPr>
           <w:rFonts w:ascii="Book Antiqua" w:hAnsi="Book Antiqua"/>
-          <w:sz w:val="24"/>
-          <w:lang w:val="en-US"/>
-        </w:rPr>
-      </w:pPr>
-      <w:r>
-        <w:rPr>
-          <w:rFonts w:ascii="Book Antiqua" w:hAnsi="Book Antiqua"/>
-          <w:sz w:val="24"/>
-          <w:lang w:val="en-US"/>
-        </w:rPr>
-        <w:t>b. Cleanliness – Since the working medium is air, there is no risk of fluid contamination. Exhaust air is simply released into the atmosphere, which is ideal for industries with strict hygiene standards such as food and pharmaceutical manufacturing.</w:t>
+          <w:b/>
+          <w:sz w:val="24"/>
+          <w:lang w:val="en-US"/>
+        </w:rPr>
+      </w:pPr>
+      <w:r>
+        <w:rPr>
+          <w:rFonts w:ascii="Book Antiqua" w:hAnsi="Book Antiqua"/>
+          <w:b/>
+          <w:sz w:val="24"/>
+          <w:lang w:val="en-US"/>
+        </w:rPr>
+        <w:t>4. Components of a Pneumatic System</w:t>
       </w:r>
     </w:p>
     <w:p>
@@ -1431,213 +1626,40 @@
         <w:jc w:val="both"/>
         <w:rPr>
           <w:rFonts w:ascii="Book Antiqua" w:hAnsi="Book Antiqua"/>
-          <w:sz w:val="24"/>
-          <w:lang w:val="en-US"/>
-        </w:rPr>
-      </w:pPr>
-      <w:r>
-        <w:rPr>
-          <w:rFonts w:ascii="Book Antiqua" w:hAnsi="Book Antiqua"/>
-          <w:sz w:val="24"/>
-          <w:lang w:val="en-US"/>
-        </w:rPr>
-        <w:t>c. High Speed Operation – Pneumatic actuators can operate at very high speeds compared to hydraulic and electric systems, enabling rapid repetitive movements required in assembly lines and packaging machines.</w:t>
-      </w:r>
-    </w:p>
-    <w:p>
-      <w:pPr>
-        <w:spacing w:after="0" w:line="360" w:lineRule="auto"/>
+          <w:b/>
+          <w:sz w:val="24"/>
+          <w:lang w:val="en-US"/>
+        </w:rPr>
+      </w:pPr>
+      <w:r>
+        <w:rPr>
+          <w:rFonts w:ascii="Book Antiqua" w:hAnsi="Book Antiqua"/>
+          <w:b/>
+          <w:sz w:val="24"/>
+          <w:lang w:val="en-US"/>
+        </w:rPr>
+        <w:t>a. Air Compressor</w:t>
+      </w:r>
+    </w:p>
+    <w:p xmlns:w="http://schemas.openxmlformats.org/wordprocessingml/2006/main">
+      <w:pPr>
+        <w:spacing w:before="60" w:after="60" w:line="240" w:lineRule="auto"/>
         <w:jc w:val="both"/>
         <w:rPr>
           <w:rFonts w:ascii="Book Antiqua" w:hAnsi="Book Antiqua"/>
           <w:sz w:val="24"/>
-          <w:lang w:val="en-US"/>
-        </w:rPr>
-      </w:pPr>
-      <w:r>
-        <w:rPr>
-          <w:rFonts w:ascii="Book Antiqua" w:hAnsi="Book Antiqua"/>
-          <w:sz w:val="24"/>
-          <w:lang w:val="en-US"/>
-        </w:rPr>
-        <w:t>d. Simplicity and Low Maintenance – Pneumatic components are relatively simple in design, easy to install, and require less maintenance compared to hydraulic systems. There is no need for return lines since exhaust air is vented to the atmosphere.</w:t>
-      </w:r>
-    </w:p>
-    <w:p>
-      <w:pPr>
-        <w:spacing w:after="0" w:line="360" w:lineRule="auto"/>
-        <w:jc w:val="both"/>
-        <w:rPr>
-          <w:rFonts w:ascii="Book Antiqua" w:hAnsi="Book Antiqua"/>
-          <w:sz w:val="24"/>
-          <w:lang w:val="en-US"/>
-        </w:rPr>
-      </w:pPr>
-      <w:r>
-        <w:rPr>
-          <w:rFonts w:ascii="Book Antiqua" w:hAnsi="Book Antiqua"/>
-          <w:sz w:val="24"/>
-          <w:lang w:val="en-US"/>
-        </w:rPr>
-        <w:t>e. Energy Storage – Compressed air can be stored in receiver tanks and used on demand, providing a readily available power source even during peak demand periods without overloading the compressor.</w:t>
-      </w:r>
-    </w:p>
-    <w:p>
-      <w:pPr>
-        <w:spacing w:after="0" w:line="360" w:lineRule="auto"/>
-        <w:jc w:val="both"/>
-        <w:rPr>
-          <w:rFonts w:ascii="Book Antiqua" w:hAnsi="Book Antiqua"/>
-          <w:b/>
-          <w:sz w:val="24"/>
-          <w:lang w:val="en-US"/>
-        </w:rPr>
-      </w:pPr>
-      <w:r>
-        <w:rPr>
-          <w:rFonts w:ascii="Book Antiqua" w:hAnsi="Book Antiqua"/>
-          <w:b/>
-          <w:sz w:val="24"/>
-          <w:lang w:val="en-US"/>
-        </w:rPr>
-        <w:t>3. Limitations of Pneumatic Systems</w:t>
-      </w:r>
-    </w:p>
-    <w:p>
-      <w:pPr>
-        <w:spacing w:after="0" w:line="360" w:lineRule="auto"/>
-        <w:jc w:val="both"/>
-        <w:rPr>
-          <w:rFonts w:ascii="Book Antiqua" w:hAnsi="Book Antiqua"/>
-          <w:sz w:val="24"/>
-          <w:lang w:val="en-US"/>
-        </w:rPr>
-      </w:pPr>
-      <w:r>
-        <w:rPr>
-          <w:rFonts w:ascii="Book Antiqua" w:hAnsi="Book Antiqua"/>
-          <w:sz w:val="24"/>
-          <w:lang w:val="en-US"/>
-        </w:rPr>
-        <w:t>a. Limited Force Output – Pneumatic systems operate at relatively low pressures (typically 6 to 10 bar), which limits the force they can generate. They are not suitable for heavy-load applications that require very high forces, unlike hydraulic systems that can operate at pressures exceeding 300 bar.</w:t>
-      </w:r>
-    </w:p>
-    <w:p>
-      <w:pPr>
-        <w:spacing w:after="0" w:line="360" w:lineRule="auto"/>
-        <w:jc w:val="both"/>
-        <w:rPr>
-          <w:rFonts w:ascii="Book Antiqua" w:hAnsi="Book Antiqua"/>
-          <w:sz w:val="24"/>
-          <w:lang w:val="en-US"/>
-        </w:rPr>
-      </w:pPr>
-      <w:r>
-        <w:rPr>
-          <w:rFonts w:ascii="Book Antiqua" w:hAnsi="Book Antiqua"/>
-          <w:sz w:val="24"/>
-          <w:lang w:val="en-US"/>
-        </w:rPr>
-        <w:t>b. Compressibility of Air – Air is compressible, which makes precise speed and position control more difficult compared to hydraulic systems. The compressibility causes jerky or erratic movements in some applications requiring fine motion control.</w:t>
-      </w:r>
-    </w:p>
-    <w:p>
-      <w:pPr>
-        <w:spacing w:after="0" w:line="360" w:lineRule="auto"/>
-        <w:jc w:val="both"/>
-        <w:rPr>
-          <w:rFonts w:ascii="Book Antiqua" w:hAnsi="Book Antiqua"/>
-          <w:sz w:val="24"/>
-          <w:lang w:val="en-US"/>
-        </w:rPr>
-      </w:pPr>
-      <w:r>
-        <w:rPr>
-          <w:rFonts w:ascii="Book Antiqua" w:hAnsi="Book Antiqua"/>
-          <w:sz w:val="24"/>
-          <w:lang w:val="en-US"/>
-        </w:rPr>
-        <w:t>c. Noise – The exhaust of compressed air produces significant noise, which may require the use of silencers or mufflers in work environments to comply with occupational health and safety standards.</w:t>
-      </w:r>
-    </w:p>
-    <w:p>
-      <w:pPr>
-        <w:spacing w:after="0" w:line="360" w:lineRule="auto"/>
-        <w:jc w:val="both"/>
-        <w:rPr>
-          <w:rFonts w:ascii="Book Antiqua" w:hAnsi="Book Antiqua"/>
-          <w:sz w:val="24"/>
-          <w:lang w:val="en-US"/>
-        </w:rPr>
-      </w:pPr>
-      <w:r>
-        <w:rPr>
-          <w:rFonts w:ascii="Book Antiqua" w:hAnsi="Book Antiqua"/>
-          <w:sz w:val="24"/>
-          <w:lang w:val="en-US"/>
-        </w:rPr>
-        <w:t>d. Energy Inefficiency – Compressing air consumes a large amount of electrical energy, and a significant portion is lost as heat during compression. The overall energy efficiency of pneumatic systems is relatively low compared to electric drive systems.</w:t>
-      </w:r>
-    </w:p>
-    <w:p>
-      <w:pPr>
-        <w:spacing w:after="0" w:line="360" w:lineRule="auto"/>
-        <w:jc w:val="both"/>
-        <w:rPr>
-          <w:rFonts w:ascii="Book Antiqua" w:hAnsi="Book Antiqua"/>
-          <w:b/>
-          <w:sz w:val="24"/>
-          <w:lang w:val="en-US"/>
-        </w:rPr>
-      </w:pPr>
-      <w:r>
-        <w:rPr>
-          <w:rFonts w:ascii="Book Antiqua" w:hAnsi="Book Antiqua"/>
-          <w:b/>
-          <w:sz w:val="24"/>
-          <w:lang w:val="en-US"/>
-        </w:rPr>
-        <w:t>4. Components of a Pneumatic System</w:t>
-      </w:r>
-    </w:p>
-    <w:p>
-      <w:pPr>
-        <w:spacing w:after="0" w:line="360" w:lineRule="auto"/>
-        <w:jc w:val="both"/>
-        <w:rPr>
-          <w:rFonts w:ascii="Book Antiqua" w:hAnsi="Book Antiqua"/>
-          <w:b/>
-          <w:sz w:val="24"/>
-          <w:lang w:val="en-US"/>
-        </w:rPr>
-      </w:pPr>
-      <w:r>
-        <w:rPr>
-          <w:rFonts w:ascii="Book Antiqua" w:hAnsi="Book Antiqua"/>
-          <w:b/>
-          <w:sz w:val="24"/>
-          <w:lang w:val="en-US"/>
-        </w:rPr>
-        <w:t>a. Air Compressor</w:t>
-      </w:r>
-    </w:p>
-    <w:p>
-      <w:pPr>
-        <w:spacing w:after="0" w:line="360" w:lineRule="auto"/>
-        <w:jc w:val="both"/>
-        <w:rPr>
-          <w:rFonts w:ascii="Book Antiqua" w:hAnsi="Book Antiqua"/>
-          <w:sz w:val="24"/>
-          <w:lang w:val="en-US"/>
-        </w:rPr>
-      </w:pPr>
-      <w:r>
-        <w:rPr>
-          <w:rFonts w:ascii="Book Antiqua" w:hAnsi="Book Antiqua"/>
-          <w:sz w:val="24"/>
-          <w:lang w:val="en-US"/>
-        </w:rPr>
-        <w:t>The air compressor is the heart of a pneumatic system. It draws in atmospheric air and compresses it to the required operating pressure. Common types include reciprocating (piston), rotary screw, and centrifugal compressors. The compressed air is then stored in a receiver tank for distribution.</w:t>
+          <w:szCs w:val="24"/>
+          <w:lang w:val="en-US"/>
+        </w:rPr>
+      </w:pPr>
+      <w:r>
+        <w:rPr>
+          <w:rFonts w:ascii="Book Antiqua" w:hAnsi="Book Antiqua"/>
+          <w:sz w:val="24"/>
+          <w:szCs w:val="24"/>
+          <w:lang w:val="en-US"/>
+        </w:rPr>
+        <w:t xml:space="preserve">The air compressor draws in atmospheric air and compresses it to the required pressure to power the system.</w:t>
       </w:r>
     </w:p>
     <w:p>
@@ -1684,23 +1706,25 @@
         <w:t>b. Receiver Tank (Air Reservoir)</w:t>
       </w:r>
     </w:p>
-    <w:p>
-      <w:pPr>
-        <w:spacing w:after="0" w:line="360" w:lineRule="auto"/>
+    <w:p xmlns:w="http://schemas.openxmlformats.org/wordprocessingml/2006/main">
+      <w:pPr>
+        <w:spacing w:before="60" w:after="60" w:line="240" w:lineRule="auto"/>
         <w:jc w:val="both"/>
         <w:rPr>
           <w:rFonts w:ascii="Book Antiqua" w:hAnsi="Book Antiqua"/>
           <w:sz w:val="24"/>
-          <w:lang w:val="en-US"/>
-        </w:rPr>
-      </w:pPr>
-      <w:r>
-        <w:rPr>
-          <w:rFonts w:ascii="Book Antiqua" w:hAnsi="Book Antiqua"/>
-          <w:sz w:val="24"/>
-          <w:lang w:val="en-US"/>
-        </w:rPr>
-        <w:t>The receiver tank stores the compressed air produced by the compressor. It acts as a buffer to handle sudden demands, reduce pressure fluctuations, and allow condensed moisture to settle before the air enters the distribution system. It is typically equipped with a pressure gauge, safety relief valve, and drain valve.</w:t>
+          <w:szCs w:val="24"/>
+          <w:lang w:val="en-US"/>
+        </w:rPr>
+      </w:pPr>
+      <w:r>
+        <w:rPr>
+          <w:rFonts w:ascii="Book Antiqua" w:hAnsi="Book Antiqua"/>
+          <w:sz w:val="24"/>
+          <w:szCs w:val="24"/>
+          <w:lang w:val="en-US"/>
+        </w:rPr>
+        <w:t xml:space="preserve">The receiver tank stores compressed air and acts as a buffer to stabilize pressure in the system.</w:t>
       </w:r>
     </w:p>
     <w:p>
@@ -1747,23 +1771,25 @@
         <w:t>c. FRL Unit (Filter, Regulator, Lubricator)</w:t>
       </w:r>
     </w:p>
-    <w:p>
-      <w:pPr>
-        <w:spacing w:after="0" w:line="360" w:lineRule="auto"/>
+    <w:p xmlns:w="http://schemas.openxmlformats.org/wordprocessingml/2006/main">
+      <w:pPr>
+        <w:spacing w:before="60" w:after="60" w:line="240" w:lineRule="auto"/>
         <w:jc w:val="both"/>
         <w:rPr>
           <w:rFonts w:ascii="Book Antiqua" w:hAnsi="Book Antiqua"/>
           <w:sz w:val="24"/>
-          <w:lang w:val="en-US"/>
-        </w:rPr>
-      </w:pPr>
-      <w:r>
-        <w:rPr>
-          <w:rFonts w:ascii="Book Antiqua" w:hAnsi="Book Antiqua"/>
-          <w:sz w:val="24"/>
-          <w:lang w:val="en-US"/>
-        </w:rPr>
-        <w:t>The FRL unit is an air preparation assembly installed between the compressor and the pneumatic circuit. The Filter removes dust, water droplets, and contaminants from the compressed air. The Regulator reduces and stabilizes the supply pressure to the required working pressure. The Lubricator adds a fine mist of oil to the air stream to lubricate downstream components such as valves and cylinders, extending their service life.</w:t>
+          <w:szCs w:val="24"/>
+          <w:lang w:val="en-US"/>
+        </w:rPr>
+      </w:pPr>
+      <w:r>
+        <w:rPr>
+          <w:rFonts w:ascii="Book Antiqua" w:hAnsi="Book Antiqua"/>
+          <w:sz w:val="24"/>
+          <w:szCs w:val="24"/>
+          <w:lang w:val="en-US"/>
+        </w:rPr>
+        <w:t xml:space="preserve">The FRL unit filters, regulates, and lubricates the compressed air before it reaches the pneumatic components.</w:t>
       </w:r>
     </w:p>
     <w:p>
@@ -1810,23 +1836,25 @@
         <w:t>d. Directional Control Valve (DCV)</w:t>
       </w:r>
     </w:p>
-    <w:p>
-      <w:pPr>
-        <w:spacing w:after="0" w:line="360" w:lineRule="auto"/>
+    <w:p xmlns:w="http://schemas.openxmlformats.org/wordprocessingml/2006/main">
+      <w:pPr>
+        <w:spacing w:before="60" w:after="60" w:line="240" w:lineRule="auto"/>
         <w:jc w:val="both"/>
         <w:rPr>
           <w:rFonts w:ascii="Book Antiqua" w:hAnsi="Book Antiqua"/>
           <w:sz w:val="24"/>
-          <w:lang w:val="en-US"/>
-        </w:rPr>
-      </w:pPr>
-      <w:r>
-        <w:rPr>
-          <w:rFonts w:ascii="Book Antiqua" w:hAnsi="Book Antiqua"/>
-          <w:sz w:val="24"/>
-          <w:lang w:val="en-US"/>
-        </w:rPr>
-        <w:t>The directional control valve controls the direction of airflow to and from the pneumatic actuator. It determines whether the piston in a cylinder extends or retracts by switching the flow path of compressed air. Common types include the 3/2-way valve (3 ports, 2 positions) and the 5/2-way valve (5 ports, 2 positions). DCVs can be actuated manually, mechanically, pneumatically, or electrically via solenoids.</w:t>
+          <w:szCs w:val="24"/>
+          <w:lang w:val="en-US"/>
+        </w:rPr>
+      </w:pPr>
+      <w:r>
+        <w:rPr>
+          <w:rFonts w:ascii="Book Antiqua" w:hAnsi="Book Antiqua"/>
+          <w:sz w:val="24"/>
+          <w:szCs w:val="24"/>
+          <w:lang w:val="en-US"/>
+        </w:rPr>
+        <w:t xml:space="preserve">The DCV controls the direction of airflow to extend or retract the pneumatic cylinder.</w:t>
       </w:r>
     </w:p>
     <w:p>
@@ -1873,23 +1901,25 @@
         <w:t>e. Pneumatic Cylinder (Actuator)</w:t>
       </w:r>
     </w:p>
-    <w:p>
-      <w:pPr>
-        <w:spacing w:after="0" w:line="360" w:lineRule="auto"/>
+    <w:p xmlns:w="http://schemas.openxmlformats.org/wordprocessingml/2006/main">
+      <w:pPr>
+        <w:spacing w:before="60" w:after="60" w:line="240" w:lineRule="auto"/>
         <w:jc w:val="both"/>
         <w:rPr>
           <w:rFonts w:ascii="Book Antiqua" w:hAnsi="Book Antiqua"/>
           <w:sz w:val="24"/>
-          <w:lang w:val="en-US"/>
-        </w:rPr>
-      </w:pPr>
-      <w:r>
-        <w:rPr>
-          <w:rFonts w:ascii="Book Antiqua" w:hAnsi="Book Antiqua"/>
-          <w:sz w:val="24"/>
-          <w:lang w:val="en-US"/>
-        </w:rPr>
-        <w:t>The pneumatic cylinder is the primary output device (actuator) in a pneumatic system. It converts the energy of compressed air into linear mechanical motion. A double-acting cylinder uses compressed air on both sides of the piston to produce force in both the extension and retraction strokes, while a single-acting cylinder uses air pressure only for one stroke with a spring return for the other. Pneumatic cylinders are commonly used for clamping, pressing, lifting, and pushing operations in automated machinery.</w:t>
+          <w:szCs w:val="24"/>
+          <w:lang w:val="en-US"/>
+        </w:rPr>
+      </w:pPr>
+      <w:r>
+        <w:rPr>
+          <w:rFonts w:ascii="Book Antiqua" w:hAnsi="Book Antiqua"/>
+          <w:sz w:val="24"/>
+          <w:szCs w:val="24"/>
+          <w:lang w:val="en-US"/>
+        </w:rPr>
+        <w:t xml:space="preserve">The pneumatic cylinder converts compressed air energy into linear mechanical motion to perform work.</w:t>
       </w:r>
     </w:p>
     <w:p>
@@ -1936,99 +1966,109 @@
         <w:t>5. Applications of Pneumatic Systems</w:t>
       </w:r>
     </w:p>
-    <w:p>
-      <w:pPr>
-        <w:spacing w:after="0" w:line="360" w:lineRule="auto"/>
+    <w:p xmlns:w="http://schemas.openxmlformats.org/wordprocessingml/2006/main">
+      <w:pPr>
+        <w:spacing w:before="60" w:after="60" w:line="240" w:lineRule="auto"/>
         <w:jc w:val="both"/>
         <w:rPr>
           <w:rFonts w:ascii="Book Antiqua" w:hAnsi="Book Antiqua"/>
           <w:sz w:val="24"/>
-          <w:lang w:val="en-US"/>
-        </w:rPr>
-      </w:pPr>
-      <w:r>
-        <w:rPr>
-          <w:rFonts w:ascii="Book Antiqua" w:hAnsi="Book Antiqua"/>
-          <w:sz w:val="24"/>
-          <w:lang w:val="en-US"/>
-        </w:rPr>
-        <w:t>a. Manufacturing and Assembly Lines – Pneumatic cylinders and grippers are extensively used in automated assembly lines for tasks such as part transfer, pressing, clamping, and ejection. The speed and repeatability of pneumatic actuators make them ideal for high-volume production environments.</w:t>
-      </w:r>
-    </w:p>
-    <w:p>
-      <w:pPr>
-        <w:spacing w:after="0" w:line="360" w:lineRule="auto"/>
+          <w:szCs w:val="24"/>
+          <w:lang w:val="en-US"/>
+        </w:rPr>
+      </w:pPr>
+      <w:r>
+        <w:rPr>
+          <w:rFonts w:ascii="Book Antiqua" w:hAnsi="Book Antiqua"/>
+          <w:sz w:val="24"/>
+          <w:szCs w:val="24"/>
+          <w:lang w:val="en-US"/>
+        </w:rPr>
+        <w:t xml:space="preserve">a. Manufacturing and Assembly Lines – Used for clamping, pressing, and material handling in automated production.</w:t>
+      </w:r>
+    </w:p>
+    <w:p xmlns:w="http://schemas.openxmlformats.org/wordprocessingml/2006/main">
+      <w:pPr>
+        <w:spacing w:before="60" w:after="60" w:line="240" w:lineRule="auto"/>
         <w:jc w:val="both"/>
         <w:rPr>
           <w:rFonts w:ascii="Book Antiqua" w:hAnsi="Book Antiqua"/>
           <w:sz w:val="24"/>
-          <w:lang w:val="en-US"/>
-        </w:rPr>
-      </w:pPr>
-      <w:r>
-        <w:rPr>
-          <w:rFonts w:ascii="Book Antiqua" w:hAnsi="Book Antiqua"/>
-          <w:sz w:val="24"/>
-          <w:lang w:val="en-US"/>
-        </w:rPr>
-        <w:t>b. Braking Systems in Vehicles – Pneumatic braking systems are used in heavy commercial vehicles such as trucks, buses, and trains. Air brakes provide reliable and consistent stopping power even under heavy loads, and fail-safe spring brakes engage automatically when air pressure is lost.</w:t>
-      </w:r>
-    </w:p>
-    <w:p>
-      <w:pPr>
-        <w:spacing w:after="0" w:line="360" w:lineRule="auto"/>
+          <w:szCs w:val="24"/>
+          <w:lang w:val="en-US"/>
+        </w:rPr>
+      </w:pPr>
+      <w:r>
+        <w:rPr>
+          <w:rFonts w:ascii="Book Antiqua" w:hAnsi="Book Antiqua"/>
+          <w:sz w:val="24"/>
+          <w:szCs w:val="24"/>
+          <w:lang w:val="en-US"/>
+        </w:rPr>
+        <w:t xml:space="preserve">b. Braking Systems in Vehicles – Used in trucks and buses for reliable air-powered braking.</w:t>
+      </w:r>
+    </w:p>
+    <w:p xmlns:w="http://schemas.openxmlformats.org/wordprocessingml/2006/main">
+      <w:pPr>
+        <w:spacing w:before="60" w:after="60" w:line="240" w:lineRule="auto"/>
         <w:jc w:val="both"/>
         <w:rPr>
           <w:rFonts w:ascii="Book Antiqua" w:hAnsi="Book Antiqua"/>
           <w:sz w:val="24"/>
-          <w:lang w:val="en-US"/>
-        </w:rPr>
-      </w:pPr>
-      <w:r>
-        <w:rPr>
-          <w:rFonts w:ascii="Book Antiqua" w:hAnsi="Book Antiqua"/>
-          <w:sz w:val="24"/>
-          <w:lang w:val="en-US"/>
-        </w:rPr>
-        <w:t>c. Pneumatic Tools – Air-powered tools such as pneumatic drills, impact wrenches, nail guns, spray guns, and sandblasters are widely used in construction, automotive repair, and woodworking industries. These tools are lighter, more powerful, and more durable than their electric equivalents for sustained heavy-duty use.</w:t>
-      </w:r>
-    </w:p>
-    <w:p>
-      <w:pPr>
-        <w:spacing w:after="0" w:line="360" w:lineRule="auto"/>
+          <w:szCs w:val="24"/>
+          <w:lang w:val="en-US"/>
+        </w:rPr>
+      </w:pPr>
+      <w:r>
+        <w:rPr>
+          <w:rFonts w:ascii="Book Antiqua" w:hAnsi="Book Antiqua"/>
+          <w:sz w:val="24"/>
+          <w:szCs w:val="24"/>
+          <w:lang w:val="en-US"/>
+        </w:rPr>
+        <w:t xml:space="preserve">c. Pneumatic Tools – Includes air drills, impact wrenches, and nail guns used in construction and repair.</w:t>
+      </w:r>
+    </w:p>
+    <w:p xmlns:w="http://schemas.openxmlformats.org/wordprocessingml/2006/main">
+      <w:pPr>
+        <w:spacing w:before="60" w:after="60" w:line="240" w:lineRule="auto"/>
         <w:jc w:val="both"/>
         <w:rPr>
           <w:rFonts w:ascii="Book Antiqua" w:hAnsi="Book Antiqua"/>
           <w:sz w:val="24"/>
-          <w:lang w:val="en-US"/>
-        </w:rPr>
-      </w:pPr>
-      <w:r>
-        <w:rPr>
-          <w:rFonts w:ascii="Book Antiqua" w:hAnsi="Book Antiqua"/>
-          <w:sz w:val="24"/>
-          <w:lang w:val="en-US"/>
-        </w:rPr>
-        <w:t>d. Food and Beverage Industry – Pneumatic systems are used for filling, sealing, labeling, and packaging operations in food and beverage plants. Because compressed air is clean and oil-free (when properly filtered), it is safe for use in environments where contact with food products is possible.</w:t>
-      </w:r>
-    </w:p>
-    <w:p>
-      <w:pPr>
-        <w:spacing w:after="0" w:line="360" w:lineRule="auto"/>
+          <w:szCs w:val="24"/>
+          <w:lang w:val="en-US"/>
+        </w:rPr>
+      </w:pPr>
+      <w:r>
+        <w:rPr>
+          <w:rFonts w:ascii="Book Antiqua" w:hAnsi="Book Antiqua"/>
+          <w:sz w:val="24"/>
+          <w:szCs w:val="24"/>
+          <w:lang w:val="en-US"/>
+        </w:rPr>
+        <w:t xml:space="preserve">d. Food and Beverage Industry – Used for filling, sealing, and packaging in clean production environments.</w:t>
+      </w:r>
+    </w:p>
+    <w:p xmlns:w="http://schemas.openxmlformats.org/wordprocessingml/2006/main">
+      <w:pPr>
+        <w:spacing w:before="60" w:after="60" w:line="240" w:lineRule="auto"/>
         <w:jc w:val="both"/>
         <w:rPr>
           <w:rFonts w:ascii="Book Antiqua" w:hAnsi="Book Antiqua"/>
           <w:sz w:val="24"/>
-          <w:lang w:val="en-US"/>
-        </w:rPr>
-      </w:pPr>
-      <w:r>
-        <w:rPr>
-          <w:rFonts w:ascii="Book Antiqua" w:hAnsi="Book Antiqua"/>
-          <w:sz w:val="24"/>
-          <w:lang w:val="en-US"/>
-        </w:rPr>
-        <w:t>e. Medical Equipment – Pneumatic systems are used in ventilators, dental drills, surgical tools, and patient transfer systems in the healthcare industry. The clean and controllable nature of compressed air makes it suitable for sensitive medical applications where precision and hygiene are critical.</w:t>
+          <w:szCs w:val="24"/>
+          <w:lang w:val="en-US"/>
+        </w:rPr>
+      </w:pPr>
+      <w:r>
+        <w:rPr>
+          <w:rFonts w:ascii="Book Antiqua" w:hAnsi="Book Antiqua"/>
+          <w:sz w:val="24"/>
+          <w:szCs w:val="24"/>
+          <w:lang w:val="en-US"/>
+        </w:rPr>
+        <w:t xml:space="preserve">e. Medical Equipment – Used in ventilators, dental drills, and surgical tools.</w:t>
       </w:r>
     </w:p>
     <w:p>
@@ -2069,7 +2109,7 @@
           <w:szCs w:val="24"/>
           <w:lang w:val="en-US"/>
         </w:rPr>
-        <w:t xml:space="preserve">This laboratory activity gave a clear understanding of pneumatic systems and their industrial applications. The study of its components — from the air compressor to the pneumatic cylinder — showed how compressed air is effectively used to transmit power in various industrial settings. Despite its limitations such as noise and limited force output, pneumatic systems remain widely used due to their simplicity, safety, and speed.</w:t>
+        <w:t xml:space="preserve">Pneumatic systems are practical and efficient for industrial automation due to their simplicity and safety. This activity enhanced understanding of how compressed air is generated, conditioned, and used to drive mechanical components.</w:t>
       </w:r>
     </w:p>
     <w:p>

</xml_diff>